<commit_message>
Update MIT 805 Big Data Project Part 1 Report.docx
</commit_message>
<xml_diff>
--- a/report/MIT 805 Big Data Project Part 1 Report.docx
+++ b/report/MIT 805 Big Data Project Part 1 Report.docx
@@ -1963,30 +1963,6 @@
     </w:p>
     <w:p>
       <w:pPr>
-        <w:spacing w:line="240" w:lineRule="auto"/>
-        <w:rPr>
-          <w:rFonts w:ascii="Arial" w:hAnsi="Arial" w:cs="Arial"/>
-          <w:b/>
-          <w:bCs/>
-          <w:sz w:val="22"/>
-          <w:szCs w:val="22"/>
-          <w:lang w:val="en-US"/>
-        </w:rPr>
-      </w:pPr>
-    </w:p>
-    <w:p>
-      <w:pPr>
-        <w:spacing w:line="240" w:lineRule="auto"/>
-        <w:rPr>
-          <w:rFonts w:ascii="Arial" w:hAnsi="Arial" w:cs="Arial"/>
-          <w:sz w:val="22"/>
-          <w:szCs w:val="22"/>
-          <w:lang w:val="en-US"/>
-        </w:rPr>
-      </w:pPr>
-    </w:p>
-    <w:p>
-      <w:pPr>
         <w:pStyle w:val="ListParagraph"/>
         <w:numPr>
           <w:ilvl w:val="0"/>
@@ -2013,6 +1989,7 @@
           <w:u w:val="single"/>
           <w:lang w:val="en-US"/>
         </w:rPr>
+        <w:lastRenderedPageBreak/>
         <w:t>Discussion of 7 Vs</w:t>
       </w:r>
     </w:p>
@@ -2857,6 +2834,13 @@
     <w:p>
       <w:pPr>
         <w:spacing w:line="240" w:lineRule="auto"/>
+        <w:rPr>
+          <w:lang w:val="en-US"/>
+        </w:rPr>
+      </w:pPr>
+    </w:p>
+    <w:p>
+      <w:pPr>
         <w:rPr>
           <w:lang w:val="en-US"/>
         </w:rPr>
@@ -5385,11 +5369,11 @@
   <w:rsids>
     <w:rsidRoot w:val="009A76AC"/>
     <w:rsid w:val="008D14F5"/>
+    <w:rsid w:val="00916BFA"/>
     <w:rsid w:val="009A76AC"/>
     <w:rsid w:val="00C064AF"/>
     <w:rsid w:val="00D75AC7"/>
     <w:rsid w:val="00DE5712"/>
-    <w:rsid w:val="00F62305"/>
   </w:rsids>
   <m:mathPr>
     <m:mathFont m:val="Cambria Math"/>

</xml_diff>